<commit_message>
Link the live Vercel app in README, deploy docs and project documents
https://dentex-tooth-detection.vercel.app/

Co-Authored-By: Claude Opus 5 (1M context) <noreply@anthropic.com>
</commit_message>
<xml_diff>
--- a/docs/DENTEX_Project_Overview.docx
+++ b/docs/DENTEX_Project_Overview.docx
@@ -2407,10 +2407,10 @@
         <w:rPr>
           <w:b/>
         </w:rPr>
-        <w:t xml:space="preserve">Local web app: </w:t>
+        <w:t xml:space="preserve">Live app (no installation needed): </w:t>
       </w:r>
       <w:r>
-        <w:t>conda activate dentex, then python app/app.py, and open http://127.0.0.1:7860. Upload an X-ray (examples in data/yolo/images/test/).</w:t>
+        <w:t>https://dentex-tooth-detection.vercel.app/. Open the link, upload a panoramic X-ray and click Analyze to see the findings, confidence and error ranges.</w:t>
       </w:r>
     </w:p>
     <w:p>
@@ -2421,10 +2421,10 @@
         <w:rPr>
           <w:b/>
         </w:rPr>
-        <w:t xml:space="preserve">Online: </w:t>
+        <w:t xml:space="preserve">Local web app: </w:t>
       </w:r>
       <w:r>
-        <w:t>deploy the deploy/vercel folder to Vercel (set Root Directory to deploy/vercel).</w:t>
+        <w:t>conda activate dentex, then python app/app.py, and open http://127.0.0.1:7860. Upload an X-ray (examples in data/yolo/images/test/). Includes the MC-dropout option.</w:t>
       </w:r>
     </w:p>
     <w:p>

</xml_diff>